<commit_message>
Re-run notebooks 03, 05, 06 with the Pachucki potential; rebuild preprint docx
Results shift by <0.1 decade (D2 rate 2.0e-64; watt-level compression
x9.22; spacings 7.3-8.2 pm); conclusions unchanged.

Co-Authored-By: Claude Opus 5.5 <noreply@anthropic.com>
Claude-Session: https://claude.ai/code/session_01Nh8jCABRuj7uKFFiU3YHUY
</commit_message>
<xml_diff>
--- a/paper/cold_fusion_gap_preprint.docx
+++ b/paper/cold_fusion_gap_preprint.docx
@@ -513,7 +513,7 @@
         <w:t xml:space="preserve"> </w:t>
       </w:r>
       <w:r>
-        <w:t xml:space="preserve">2.5×10⁻⁶⁴</w:t>
+        <w:t xml:space="preserve">2.0×10⁻⁶⁴</w:t>
       </w:r>
       <w:r>
         <w:t xml:space="preserve"> </w:t>
@@ -543,7 +543,7 @@
         <w:t xml:space="preserve"> </w:t>
       </w:r>
       <w:r>
-        <w:t xml:space="preserve">10⁻⁵⁵·²</w:t>
+        <w:t xml:space="preserve">10⁻⁵⁵·³</w:t>
       </w:r>
       <w:r>
         <w:t xml:space="preserve"> </w:t>
@@ -2135,7 +2135,7 @@
         <w:t xml:space="preserve"> </w:t>
       </w:r>
       <w:r>
-        <w:t xml:space="preserve">the H₂ Born–Oppenheimer curve [Kolos &amp; Wolniewicz 1965], splined to the He united-atom limit; heavier screening particles (mass m</w:t>
+        <w:t xml:space="preserve">the H₂ Born–Oppenheimer curve tabulated by Pachucki [2010] for R = 0.1–20 bohr (consistent with Kolos &amp; Wolniewicz 1965), splined to the He united-atom limit below 0.1 bohr; heavier screening particles (mass m</w:t>
       </w:r>
       <w:r>
         <w:rPr>
@@ -2233,7 +2233,7 @@
         <w:t xml:space="preserve"> </w:t>
       </w:r>
       <w:r>
-        <w:t xml:space="preserve">(Table 1). The solver reproduces D₂, HD and H₂ binding energies to ≤ 0.001 eV, the D₂ zero-point energy to &lt;1%, and the Koonin–Nauenberg rates for d+d and p+d. It is converged to 0.002 decades in step size and starting radius. The main systematic is the short-range potential: a 0.05 Ha error below 0.3 Å shifts the rate by 0.7 decades. We adopt ±1 decade as the working uncertainty.</w:t>
+        <w:t xml:space="preserve">(Table 1). The solver reproduces D₂, HD and H₂ binding energies to ≤ 0.001 eV, the D₂ zero-point energy to &lt;1%, and the Koonin–Nauenberg rates for d+d and p+d. It is converged to 0.002 decades in step size and starting radius. The rate is sensitive to the short-range potential (a 0.05 Ha error below 0.3 Å would shift it by 0.7 decades), but the tabulated curve is accurate to ll10⁻⁶ Ha. The residual spread among published molecular rates (factor ~3) reflects nuclear-contact modelling, and we adopt a factor of a few as the working uncertainty.</w:t>
       </w:r>
     </w:p>
     <w:tbl>
@@ -2310,7 +2310,7 @@
               <w:jc w:val="left"/>
             </w:pPr>
             <w:r>
-              <w:t xml:space="preserve">4.5556 eV</w:t>
+              <w:t xml:space="preserve">4.5559 eV</w:t>
             </w:r>
           </w:p>
         </w:tc>
@@ -2348,7 +2348,7 @@
               <w:jc w:val="left"/>
             </w:pPr>
             <w:r>
-              <w:t xml:space="preserve">4.5129 / 4.4771 eV</w:t>
+              <w:t xml:space="preserve">4.5133 / 4.4774 eV</w:t>
             </w:r>
           </w:p>
         </w:tc>
@@ -2386,7 +2386,7 @@
               <w:jc w:val="left"/>
             </w:pPr>
             <w:r>
-              <w:t xml:space="preserve">2.5×10⁻⁶⁴ s⁻¹</w:t>
+              <w:t xml:space="preserve">2.0×10⁻⁶⁴ s⁻¹</w:t>
             </w:r>
           </w:p>
         </w:tc>
@@ -2424,7 +2424,7 @@
               <w:jc w:val="left"/>
             </w:pPr>
             <w:r>
-              <w:t xml:space="preserve">10⁻⁵⁵·² s⁻¹</w:t>
+              <w:t xml:space="preserve">10⁻⁵⁵·³ s⁻¹</w:t>
             </w:r>
           </w:p>
         </w:tc>
@@ -3422,7 +3422,7 @@
         <w:t xml:space="preserve"> </w:t>
       </w:r>
       <w:r>
-        <w:t xml:space="preserve">(i) The short-range H₂ potential uses recalled Kolos–Wolniewicz values. They are supported by the binding-energy and Koonin–Nauenberg checks but were not re-read from the original table. (ii) Several literature inputs were verified only at abstract level (see VERIFICATION.md). (iii) The lattice model is a single radial pair; anisotropy, many-body exchange and defects beyond a spherical vacancy are not modelled. (iv) The screening profiles are phenomenological. (v) The heat-only analysis uses order-of-magnitude internal-conversion and pair-creation coefficients and the weak-coupling energy-gap law.</w:t>
+        <w:t xml:space="preserve">(i) The molecular potential is the Born–Oppenheimer curve; non-adiabatic and nuclear-structure corrections are not included (the published molecular rates differ by a factor ~3). (ii) Several literature inputs were verified only at abstract level (see VERIFICATION.md). (iii) The lattice model is a single radial pair; anisotropy, many-body exchange and defects beyond a spherical vacancy are not modelled. (iv) The screening profiles are phenomenological. (v) The heat-only analysis uses order-of-magnitude internal-conversion and pair-creation coefficients and the weak-coupling energy-gap law.</w:t>
       </w:r>
     </w:p>
     <w:bookmarkEnd w:id="42"/>
@@ -3696,6 +3696,18 @@
       </w:pPr>
       <w:r>
         <w:t xml:space="preserve">Kolos W. &amp; Wolniewicz L., J. Chem. Phys. 43, 2429 (1965).</w:t>
+      </w:r>
+    </w:p>
+    <w:p>
+      <w:pPr>
+        <w:numPr>
+          <w:ilvl w:val="0"/>
+          <w:numId w:val="1003"/>
+        </w:numPr>
+        <w:pStyle w:val="Compact"/>
+      </w:pPr>
+      <w:r>
+        <w:t xml:space="preserve">Pachucki K., Phys. Rev. A 82, 032509 (2010), arXiv:1007.0322.</w:t>
       </w:r>
     </w:p>
     <w:p>

</xml_diff>

<commit_message>
Notebook 05b: no neutron-free p+d window up to 2 keV screening; paper §3.5-3.6, abstract, limitations updated; README/VERIFICATION; tex2unicode \propto
Co-Authored-By: Claude Opus 5.5 <noreply@anthropic.com>
Claude-Session: https://claude.ai/code/session_01Nh8jCABRuj7uKFFiU3YHUY
</commit_message>
<xml_diff>
--- a/paper/cold_fusion_gap_preprint.docx
+++ b/paper/cold_fusion_gap_preprint.docx
@@ -1658,6 +1658,222 @@
       </w:r>
       <w:r>
         <w:t xml:space="preserve">itself.</w:t>
+      </w:r>
+      <w:r>
+        <w:t xml:space="preserve"> </w:t>
+      </w:r>
+      <w:r>
+        <w:t xml:space="preserve">The</w:t>
+      </w:r>
+      <w:r>
+        <w:t xml:space="preserve"> </w:t>
+      </w:r>
+      <w:r>
+        <w:t xml:space="preserve">bound</w:t>
+      </w:r>
+      <w:r>
+        <w:t xml:space="preserve"> </w:t>
+      </w:r>
+      <w:r>
+        <w:t xml:space="preserve">is</w:t>
+      </w:r>
+      <w:r>
+        <w:t xml:space="preserve"> </w:t>
+      </w:r>
+      <w:r>
+        <w:t xml:space="preserve">unchanged</w:t>
+      </w:r>
+      <w:r>
+        <w:t xml:space="preserve"> </w:t>
+      </w:r>
+      <w:r>
+        <w:t xml:space="preserve">when</w:t>
+      </w:r>
+      <w:r>
+        <w:t xml:space="preserve"> </w:t>
+      </w:r>
+      <w:r>
+        <w:t xml:space="preserve">the</w:t>
+      </w:r>
+      <w:r>
+        <w:t xml:space="preserve"> </w:t>
+      </w:r>
+      <w:r>
+        <w:t xml:space="preserve">screening</w:t>
+      </w:r>
+      <w:r>
+        <w:t xml:space="preserve"> </w:t>
+      </w:r>
+      <w:r>
+        <w:t xml:space="preserve">strength</w:t>
+      </w:r>
+      <w:r>
+        <w:t xml:space="preserve"> </w:t>
+      </w:r>
+      <w:r>
+        <w:t xml:space="preserve">is</w:t>
+      </w:r>
+      <w:r>
+        <w:t xml:space="preserve"> </w:t>
+      </w:r>
+      <w:r>
+        <w:t xml:space="preserve">instead</w:t>
+      </w:r>
+      <w:r>
+        <w:t xml:space="preserve"> </w:t>
+      </w:r>
+      <w:r>
+        <w:t xml:space="preserve">fitted</w:t>
+      </w:r>
+      <w:r>
+        <w:t xml:space="preserve"> </w:t>
+      </w:r>
+      <w:r>
+        <w:t xml:space="preserve">through</w:t>
+      </w:r>
+      <w:r>
+        <w:t xml:space="preserve"> </w:t>
+      </w:r>
+      <w:r>
+        <w:t xml:space="preserve">the</w:t>
+      </w:r>
+      <w:r>
+        <w:t xml:space="preserve"> </w:t>
+      </w:r>
+      <w:r>
+        <w:t xml:space="preserve">published</w:t>
+      </w:r>
+      <w:r>
+        <w:t xml:space="preserve"> </w:t>
+      </w:r>
+      <w:r>
+        <w:t xml:space="preserve">thick-target</w:t>
+      </w:r>
+      <w:r>
+        <w:t xml:space="preserve"> </w:t>
+      </w:r>
+      <w:r>
+        <w:t xml:space="preserve">procedure.</w:t>
+      </w:r>
+      <w:r>
+        <w:t xml:space="preserve"> </w:t>
+      </w:r>
+      <w:r>
+        <w:t xml:space="preserve">A</w:t>
+      </w:r>
+      <w:r>
+        <w:t xml:space="preserve"> </w:t>
+      </w:r>
+      <w:r>
+        <w:t xml:space="preserve">near-surface</w:t>
+      </w:r>
+      <w:r>
+        <w:t xml:space="preserve"> </w:t>
+      </w:r>
+      <w:r>
+        <w:t xml:space="preserve">deuterium</w:t>
+      </w:r>
+      <w:r>
+        <w:t xml:space="preserve"> </w:t>
+      </w:r>
+      <w:r>
+        <w:t xml:space="preserve">excess</w:t>
+      </w:r>
+      <w:r>
+        <w:t xml:space="preserve"> </w:t>
+      </w:r>
+      <w:r>
+        <w:t xml:space="preserve">can</w:t>
+      </w:r>
+      <w:r>
+        <w:t xml:space="preserve"> </w:t>
+      </w:r>
+      <w:r>
+        <w:t xml:space="preserve">fake</w:t>
+      </w:r>
+      <w:r>
+        <w:t xml:space="preserve"> </w:t>
+      </w:r>
+      <w:r>
+        <w:t xml:space="preserve">at</w:t>
+      </w:r>
+      <w:r>
+        <w:t xml:space="preserve"> </w:t>
+      </w:r>
+      <w:r>
+        <w:t xml:space="preserve">most</w:t>
+      </w:r>
+      <w:r>
+        <w:t xml:space="preserve"> </w:t>
+      </w:r>
+      <w:r>
+        <w:t xml:space="preserve">0.28–0.44</w:t>
+      </w:r>
+      <w:r>
+        <w:t xml:space="preserve"> </w:t>
+      </w:r>
+      <w:r>
+        <w:t xml:space="preserve">keV,</w:t>
+      </w:r>
+      <w:r>
+        <w:t xml:space="preserve"> </w:t>
+      </w:r>
+      <w:r>
+        <w:t xml:space="preserve">so</w:t>
+      </w:r>
+      <w:r>
+        <w:t xml:space="preserve"> </w:t>
+      </w:r>
+      <w:r>
+        <w:t xml:space="preserve">the</w:t>
+      </w:r>
+      <w:r>
+        <w:t xml:space="preserve"> </w:t>
+      </w:r>
+      <w:r>
+        <w:t xml:space="preserve">reported</w:t>
+      </w:r>
+      <w:r>
+        <w:t xml:space="preserve"> </w:t>
+      </w:r>
+      <w:r>
+        <w:t xml:space="preserve">1.7</w:t>
+      </w:r>
+      <w:r>
+        <w:t xml:space="preserve"> </w:t>
+      </w:r>
+      <w:r>
+        <w:t xml:space="preserve">keV</w:t>
+      </w:r>
+      <w:r>
+        <w:t xml:space="preserve"> </w:t>
+      </w:r>
+      <w:r>
+        <w:t xml:space="preserve">is</w:t>
+      </w:r>
+      <w:r>
+        <w:t xml:space="preserve"> </w:t>
+      </w:r>
+      <w:r>
+        <w:t xml:space="preserve">not</w:t>
+      </w:r>
+      <w:r>
+        <w:t xml:space="preserve"> </w:t>
+      </w:r>
+      <w:r>
+        <w:t xml:space="preserve">a</w:t>
+      </w:r>
+      <w:r>
+        <w:t xml:space="preserve"> </w:t>
+      </w:r>
+      <w:r>
+        <w:t xml:space="preserve">depth-profile</w:t>
+      </w:r>
+      <w:r>
+        <w:t xml:space="preserve"> </w:t>
+      </w:r>
+      <w:r>
+        <w:t xml:space="preserve">artifact.</w:t>
       </w:r>
       <w:r>
         <w:t xml:space="preserve"> </w:t>
@@ -2616,7 +2832,7 @@
     </w:p>
     <w:bookmarkEnd w:id="23"/>
     <w:bookmarkEnd w:id="24"/>
-    <w:bookmarkStart w:id="39" w:name="results"/>
+    <w:bookmarkStart w:id="40" w:name="results"/>
     <w:p>
       <w:pPr>
         <w:pStyle w:val="Heading1"/>
@@ -3448,29 +3664,232 @@
         <w:pStyle w:val="FirstParagraph"/>
       </w:pPr>
       <w:r>
-        <w:t xml:space="preserve">p+d → ³He + γ (5.49 MeV) has no neutron branch, so the 1990 limit does not constrain it directly. With the same beam-consistent screening (up to 575 eV), the p+d lattice rate peaks at 10⁻¹²·³ s⁻¹, ~2.5 orders short of watt level even in a 50/50 H/D mix, and coexisting d+d pairs violate the neutron limit first. 1 W of p+d would also emit ~10¹² gammas per second. Disposing of fusion energy without any radiation would require the reaction energy to go directly into the lattice. For any process through the excited ⁴He compound nucleus, suppressing neutrons even by 10⁻³ requires a lattice decay width exceeding the 23.85 MeV transition energy, and coherent transfer is causality-limited (light travels &lt;0.003 Å in the compound lifetime). We do not consider such channels further.</w:t>
-      </w:r>
-    </w:p>
-    <w:bookmarkEnd w:id="38"/>
-    <w:bookmarkEnd w:id="39"/>
-    <w:bookmarkStart w:id="40" w:name="relation-to-prior-work"/>
-    <w:p>
-      <w:pPr>
-        <w:pStyle w:val="Heading1"/>
-      </w:pPr>
-      <w:r>
-        <w:t xml:space="preserve">4. Relation to prior work</w:t>
-      </w:r>
-    </w:p>
-    <w:p>
-      <w:pPr>
-        <w:pStyle w:val="FirstParagraph"/>
-      </w:pPr>
+        <w:t xml:space="preserve">p+d → ³He + γ (5.49 MeV) has no neutron branch, so the 1990 limit does not constrain it directly. We scanned mixed H/D loading with the same beam-matched screening (notebook 05b: U</w:t>
+      </w:r>
+      <w:r>
+        <w:rPr>
+          <w:vertAlign w:val="subscript"/>
+        </w:rPr>
+        <w:t xml:space="preserve">meas</w:t>
+      </w:r>
+      <w:r>
+        <w:t xml:space="preserve"> </w:t>
+      </w:r>
+      <w:r>
+        <w:t xml:space="preserve">= 0.9, 1.7 and 2.0 keV, four profile shapes, spacings 2.75 and 0.94 Å). In 14 of the 24 variants, p+d alone would reach watt level in a 50/50 mix. But the d+d rate always matches or exceeds it (by up to 3.7 orders in peak rate), and keeping x</w:t>
+      </w:r>
+      <w:r>
+        <w:rPr>
+          <w:vertAlign w:val="subscript"/>
+        </w:rPr>
+        <w:t xml:space="preserve">D</w:t>
+      </w:r>
+      <w:r>
+        <w:t xml:space="preserve">²Γ</w:t>
+      </w:r>
+      <w:r>
+        <w:rPr>
+          <w:vertAlign w:val="subscript"/>
+        </w:rPr>
+        <w:t xml:space="preserve">dd</w:t>
+      </w:r>
+      <w:r>
+        <w:t xml:space="preserve"> </w:t>
+      </w:r>
+      <w:r>
+        <w:t xml:space="preserve">below the neutron limit forces the deuterium fraction down to x</w:t>
+      </w:r>
+      <w:r>
+        <w:rPr>
+          <w:vertAlign w:val="subscript"/>
+        </w:rPr>
+        <w:t xml:space="preserve">D</w:t>
+      </w:r>
+      <w:r>
+        <w:t xml:space="preserve"> </w:t>
+      </w:r>
+      <w:r>
+        <w:t xml:space="preserve">≈ 10⁻¹⁵–10⁻⁷.</w:t>
+      </w:r>
+      <w:r>
+        <w:t xml:space="preserve"> </w:t>
+      </w:r>
       <w:r>
         <w:rPr>
           <w:bCs/>
           <w:b/>
         </w:rPr>
+        <w:t xml:space="preserve">No variant has a window:</w:t>
+      </w:r>
+      <w:r>
+        <w:t xml:space="preserve"> </w:t>
+      </w:r>
+      <w:r>
+        <w:t xml:space="preserve">at the neutron-allowed x</w:t>
+      </w:r>
+      <w:r>
+        <w:rPr>
+          <w:vertAlign w:val="subscript"/>
+        </w:rPr>
+        <w:t xml:space="preserve">D</w:t>
+      </w:r>
+      <w:r>
+        <w:t xml:space="preserve">, p+d falls at least 2.8 orders short of watts, and 3.3–19 orders in the other variants. Escaping this would require a lattice that suppresses d–d pairing ≳4×10⁵-fold below random H/D mixing. 1 W of p+d would also emit ~10¹² gammas per second. Disposing of fusion energy without any radiation would require the reaction energy to go directly into the lattice. For any process through the excited ⁴He compound nucleus, suppressing neutrons even by 10⁻³ requires a lattice decay width exceeding the 23.85 MeV transition energy, and coherent transfer is causality-limited (light travels &lt;0.003 Å in the compound lifetime). We do not consider such channels further.</w:t>
+      </w:r>
+    </w:p>
+    <w:bookmarkEnd w:id="38"/>
+    <w:bookmarkStart w:id="39" w:name="X701717743c9fc5d52294bace499374af9d68d74"/>
+    <w:p>
+      <w:pPr>
+        <w:pStyle w:val="Heading2"/>
+      </w:pPr>
+      <w:r>
+        <w:t xml:space="preserve">3.6 Is keV screening a depth-profile artifact, and does the screening shape matter?</w:t>
+      </w:r>
+    </w:p>
+    <w:p>
+      <w:pPr>
+        <w:pStyle w:val="FirstParagraph"/>
+      </w:pPr>
+      <w:r>
+        <w:t xml:space="preserve">The beam values could be inflated if the target holds more deuterium near the surface: low-energy beams react closer to the surface. We reproduced the analysis of Karahadian et al. [2026]: thick-target yields, normalised at E</w:t>
+      </w:r>
+      <w:r>
+        <w:rPr>
+          <w:vertAlign w:val="subscript"/>
+        </w:rPr>
+        <w:t xml:space="preserve">cm</w:t>
+      </w:r>
+      <w:r>
+        <w:t xml:space="preserve"> </w:t>
+      </w:r>
+      <w:r>
+        <w:t xml:space="preserve">= 6.5 keV, with a constant U</w:t>
+      </w:r>
+      <w:r>
+        <w:rPr>
+          <w:vertAlign w:val="subscript"/>
+        </w:rPr>
+        <w:t xml:space="preserve">e</w:t>
+      </w:r>
+      <w:r>
+        <w:t xml:space="preserve"> </w:t>
+      </w:r>
+      <w:r>
+        <w:t xml:space="preserve">fitted over 2.5–6.5 keV and stopping S∝ E</w:t>
+      </w:r>
+      <w:r>
+        <w:rPr>
+          <w:vertAlign w:val="superscript"/>
+        </w:rPr>
+        <w:t xml:space="preserve">p</w:t>
+      </w:r>
+      <w:r>
+        <w:t xml:space="preserve">, p = 0.3–0.7. We applied it to targets with</w:t>
+      </w:r>
+      <w:r>
+        <w:t xml:space="preserve"> </w:t>
+      </w:r>
+      <w:r>
+        <w:rPr>
+          <w:bCs/>
+          <w:b/>
+        </w:rPr>
+        <w:t xml:space="preserve">no</w:t>
+      </w:r>
+      <w:r>
+        <w:t xml:space="preserve"> </w:t>
+      </w:r>
+      <w:r>
+        <w:t xml:space="preserve">screening and an arbitrary near-surface excess (notebook 13). Yield is linear in the deuterium density, and the low-energy beam always loses relatively more energy per unit depth. The largest apparent U</w:t>
+      </w:r>
+      <w:r>
+        <w:rPr>
+          <w:vertAlign w:val="subscript"/>
+        </w:rPr>
+        <w:t xml:space="preserve">e</w:t>
+      </w:r>
+      <w:r>
+        <w:t xml:space="preserve"> </w:t>
+      </w:r>
+      <w:r>
+        <w:t xml:space="preserve">any non-negative profile can produce is therefore the thin-target limit,</w:t>
+      </w:r>
+      <w:r>
+        <w:t xml:space="preserve"> </w:t>
+      </w:r>
+      <w:r>
+        <w:rPr>
+          <w:bCs/>
+          <w:b/>
+        </w:rPr>
+        <w:t xml:space="preserve">0.28–0.44 keV</w:t>
+      </w:r>
+      <w:r>
+        <w:t xml:space="preserve">. A tenfold excess in a layer 1–5% of the beam range fakes only 0.09–0.19 keV. Even under that extreme artifact, the reported values need genuine enhancement of at least 1.15–1.47 keV (PdD), 0.41–0.61 keV (TiD) and 0.32–0.51 keV (Pd). Depth profiles can explain a few hundred eV, but not the keV values. The sub-keV plateau, which no constant U</w:t>
+      </w:r>
+      <w:r>
+        <w:rPr>
+          <w:vertAlign w:val="subscript"/>
+        </w:rPr>
+        <w:t xml:space="preserve">e</w:t>
+      </w:r>
+      <w:r>
+        <w:t xml:space="preserve"> </w:t>
+      </w:r>
+      <w:r>
+        <w:t xml:space="preserve">describes, is outside this analysis.</w:t>
+      </w:r>
+    </w:p>
+    <w:p>
+      <w:pPr>
+        <w:pStyle w:val="BodyText"/>
+      </w:pPr>
+      <w:r>
+        <w:t xml:space="preserve">We also replaced beam matching at 0.004 Å by a fit to the data: the strength Δ U was solved so that the WKB enhancement of each profile, put through the same thick-target fit, returns the reported U</w:t>
+      </w:r>
+      <w:r>
+        <w:rPr>
+          <w:vertAlign w:val="subscript"/>
+        </w:rPr>
+        <w:t xml:space="preserve">e</w:t>
+      </w:r>
+      <w:r>
+        <w:t xml:space="preserve">. The fitted strength agrees with the beam-matched one within 4% for ℓ ≥ 0.01 Å and within 2–19% at 0.004 Å. The neutron-limit crossings at 2.75 Å are unchanged to grid resolution: at 1.7 keV they are 0.0045 Å (Yukawa), 0.118 Å (exponential) and 0.266 Å (Gaussian). The published fit constrains the shape only weakly, because a ±0.2 keV change in U</w:t>
+      </w:r>
+      <w:r>
+        <w:rPr>
+          <w:vertAlign w:val="subscript"/>
+        </w:rPr>
+        <w:t xml:space="preserve">e</w:t>
+      </w:r>
+      <w:r>
+        <w:t xml:space="preserve"> </w:t>
+      </w:r>
+      <w:r>
+        <w:t xml:space="preserve">moves the relative yields by 33–50%. Only ranges at the turning-point scale (≲0.003–0.0045 Å, depending on shape) are excluded. Claim A therefore does not depend on how the screening strength is matched to the beam data.</w:t>
+      </w:r>
+    </w:p>
+    <w:bookmarkEnd w:id="39"/>
+    <w:bookmarkEnd w:id="40"/>
+    <w:bookmarkStart w:id="41" w:name="relation-to-prior-work"/>
+    <w:p>
+      <w:pPr>
+        <w:pStyle w:val="Heading1"/>
+      </w:pPr>
+      <w:r>
+        <w:t xml:space="preserve">4. Relation to prior work</w:t>
+      </w:r>
+    </w:p>
+    <w:p>
+      <w:pPr>
+        <w:pStyle w:val="FirstParagraph"/>
+      </w:pPr>
+      <w:r>
+        <w:rPr>
+          <w:bCs/>
+          <w:b/>
+        </w:rPr>
         <w:t xml:space="preserve">Leggett &amp; Baym [1989]</w:t>
       </w:r>
       <w:r>
@@ -3555,7 +3974,7 @@
         <w:t xml:space="preserve"> </w:t>
       </w:r>
       <w:r>
-        <w:t xml:space="preserve">extraction, which motivate experiment E3. The sub-keV plateau of</w:t>
+        <w:t xml:space="preserve">extraction, which motivate experiment E3. Our §3.6 shows that such effects are bounded at ≲0.44 keV under the published fitting procedure. The sub-keV plateau of</w:t>
       </w:r>
       <w:r>
         <w:t xml:space="preserve"> </w:t>
@@ -3583,8 +4002,8 @@
         <w:t xml:space="preserve">, as the authors note; our bounds use their fitted values above 2.5 keV.</w:t>
       </w:r>
     </w:p>
-    <w:bookmarkEnd w:id="40"/>
-    <w:bookmarkStart w:id="41" w:name="proposed-experiments"/>
+    <w:bookmarkEnd w:id="41"/>
+    <w:bookmarkStart w:id="42" w:name="proposed-experiments"/>
     <w:p>
       <w:pPr>
         <w:pStyle w:val="Heading1"/>
@@ -3719,8 +4138,8 @@
         <w:t xml:space="preserve">). A 5σ answer needs ~2.6% p+d statistics, about 1.5 days per point at 1 mA.</w:t>
       </w:r>
     </w:p>
-    <w:bookmarkEnd w:id="41"/>
-    <w:bookmarkStart w:id="42" w:name="limitations"/>
+    <w:bookmarkEnd w:id="42"/>
+    <w:bookmarkStart w:id="43" w:name="limitations"/>
     <w:p>
       <w:pPr>
         <w:pStyle w:val="Heading1"/>
@@ -3738,11 +4157,11 @@
         <w:pStyle w:val="Compact"/>
       </w:pPr>
       <w:r>
-        <w:t xml:space="preserve">The screening profiles are phenomenological; four shapes span short- and long-tailed behaviour but are not derived. (ii) The lattice pair is a single radial pair; anisotropy, many-body exchange and specific defect geometries are not modelled, although lattice stiffness and spacing affect the bound only weakly. (iii) The bound relies on one null measurement [Aberdam et al. 1990]; the weaker limit of Badurek et al. (3.6×10⁻²³) loosens it only slightly. (iv) Several literature inputs were verified at abstract level; the repository’s VERIFICATION.md lists the status of each. (v) The p+d analysis was carried to 575 eV only.</w:t>
-      </w:r>
-    </w:p>
-    <w:bookmarkEnd w:id="42"/>
-    <w:bookmarkStart w:id="43" w:name="conclusions"/>
+        <w:t xml:space="preserve">The screening profiles are phenomenological; four shapes span short- and long-tailed behaviour but are not derived. (ii) The lattice pair is a single radial pair; anisotropy, many-body exchange and specific defect geometries are not modelled, although lattice stiffness and spacing affect the bound only weakly. (iii) The bound relies on one null measurement [Aberdam et al. 1990]; the weaker limit of Badurek et al. (3.6×10⁻²³) loosens it only slightly. (iv) Several literature inputs were verified at abstract level; the repository’s VERIFICATION.md lists the status of each. (v) The p+d analysis assumes random H/D occupancy; a lattice with strongly preferential p–d pairing is not excluded. (vi) The depth-artifact analysis (§3.6) uses a constant S-factor and power-law stopping, and the shape constraint uses a proxy for the published uncertainties, because the individual data points are not tabulated.</w:t>
+      </w:r>
+    </w:p>
+    <w:bookmarkEnd w:id="43"/>
+    <w:bookmarkStart w:id="44" w:name="conclusions"/>
     <w:p>
       <w:pPr>
         <w:pStyle w:val="Heading1"/>
@@ -3807,6 +4226,30 @@
         <w:pStyle w:val="Compact"/>
       </w:pPr>
       <w:r>
+        <w:t xml:space="preserve">Neutron-free p+d fusion offers no escape: up to 2 keV screening, keeping coexisting d+d pairs below the neutron limit leaves p+d at least 2.8 orders short of watts.</w:t>
+      </w:r>
+    </w:p>
+    <w:p>
+      <w:pPr>
+        <w:numPr>
+          <w:ilvl w:val="0"/>
+          <w:numId w:val="1002"/>
+        </w:numPr>
+        <w:pStyle w:val="Compact"/>
+      </w:pPr>
+      <w:r>
+        <w:t xml:space="preserve">Depth-profile artifacts cannot produce keV screening under the published fitting procedure (≤0.44 keV), and fitting the screening shape to the data leaves the bound unchanged.</w:t>
+      </w:r>
+    </w:p>
+    <w:p>
+      <w:pPr>
+        <w:numPr>
+          <w:ilvl w:val="0"/>
+          <w:numId w:val="1002"/>
+        </w:numPr>
+        <w:pStyle w:val="Compact"/>
+      </w:pPr>
+      <w:r>
         <w:t xml:space="preserve">The anomaly is therefore either confined to short range (and irrelevant at rest), or it is something other than static screening, which experiments E1–E3 are designed to tell apart.</w:t>
       </w:r>
     </w:p>
@@ -3825,7 +4268,7 @@
         <w:t xml:space="preserve"> </w:t>
       </w:r>
       <w:r>
-        <w:t xml:space="preserve">Notebooks (03, 04, 04b reproduce every number here), the solver</w:t>
+        <w:t xml:space="preserve">Notebooks (03, 04, 04b, 05b and 13 reproduce every number here), the solver</w:t>
       </w:r>
       <w:r>
         <w:t xml:space="preserve"> </w:t>
@@ -3858,8 +4301,8 @@
         <w:t xml:space="preserve">Analysis code and drafting were assisted by an AI model (Claude, Anthropic); all results are reproducible from the repository.</w:t>
       </w:r>
     </w:p>
-    <w:bookmarkEnd w:id="43"/>
-    <w:bookmarkStart w:id="44" w:name="X123ca237e9738b9b2c63123fe4f17b9bcc7cbef"/>
+    <w:bookmarkEnd w:id="44"/>
+    <w:bookmarkStart w:id="45" w:name="X123ca237e9738b9b2c63123fe4f17b9bcc7cbef"/>
     <w:p>
       <w:pPr>
         <w:pStyle w:val="Heading1"/>
@@ -4072,7 +4515,7 @@
         <w:t xml:space="preserve">Zhou J. et al., Chin. Phys. Lett. (2006), d(d,γ)⁴He branching at 20 keV.</w:t>
       </w:r>
     </w:p>
-    <w:bookmarkEnd w:id="44"/>
+    <w:bookmarkEnd w:id="45"/>
     <w:sectPr/>
   </w:body>
 </w:document>

</xml_diff>